<commit_message>
refactor: v2.0.0 generalize to discrete manufacturing
</commit_message>
<xml_diff>
--- a/01-精益工具知识库/01-精益基础/01-精益哲学与原则.docx
+++ b/01-精益工具知识库/01-精益基础/01-精益哲学与原则.docx
@@ -30,7 +30,7 @@
           <w:i/>
           <w:sz w:val="20"/>
         </w:rPr>
-        <w:t>本文档为金属紧固件制造企业精益转型的基础知识文档，系统介绍精益思想的起源、核心理念、五大原则及其在紧固件行业的应用意义。</w:t>
+        <w:t>本文档为离散制造企业精益转型的基础知识文档，系统介绍精益思想的起源、核心理念、五大原则及其在制造业的应用意义。</w:t>
       </w:r>
     </w:p>
     <w:p>
@@ -130,7 +130,7 @@
           <w:color w:val="2E75B6"/>
           <w:sz w:val="22"/>
         </w:rPr>
-        <w:t>紧固件行业精益转型的意义</w:t>
+        <w:t>制造业精益转型的意义</w:t>
       </w:r>
     </w:p>
     <w:p>
@@ -1542,7 +1542,7 @@
           <w:i w:val="0"/>
           <w:sz w:val="22"/>
         </w:rPr>
-        <w:t>在紧固件行业的应用</w:t>
+        <w:t>在制造业的应用：</w:t>
       </w:r>
       <w:r>
         <w:rPr>
@@ -1551,7 +1551,6 @@
           <w:i w:val="0"/>
           <w:sz w:val="22"/>
         </w:rPr>
-        <w:t>：</w:t>
       </w:r>
     </w:p>
     <w:p>
@@ -1565,7 +1564,7 @@
           <w:i w:val="0"/>
           <w:sz w:val="22"/>
         </w:rPr>
-        <w:t>客户需要的是满足强度要求、尺寸精度和耐腐蚀性能的紧固件</w:t>
+        <w:t>客户需要的是满足强度要求、尺寸精度和耐腐蚀性能的产品</w:t>
       </w:r>
     </w:p>
     <w:p>
@@ -1709,7 +1708,7 @@
           <w:i w:val="0"/>
           <w:sz w:val="22"/>
         </w:rPr>
-        <w:t>在紧固件行业的典型价值流</w:t>
+        <w:t>在制造业的典型价值流：</w:t>
       </w:r>
       <w:r>
         <w:rPr>
@@ -1718,7 +1717,6 @@
           <w:i w:val="0"/>
           <w:sz w:val="22"/>
         </w:rPr>
-        <w:t>：</w:t>
       </w:r>
     </w:p>
     <w:p>
@@ -1739,7 +1737,7 @@
           <w:color w:val="333333"/>
           <w:sz w:val="18"/>
         </w:rPr>
-        <w:t>原材料采购 → 下料/冷镦 → 螺纹加工 → 热处理 → 表面处理 → 质量检验 → 包装入库 → 客户交付</w:t>
+        <w:t>原材料采购 → 下料/机加工 → 精加工 → 热处理 → 表面处理 → 质量检验 → 包装入库 → 客户交付</w:t>
       </w:r>
     </w:p>
     <w:p>
@@ -1855,7 +1853,7 @@
           <w:i w:val="0"/>
           <w:sz w:val="22"/>
         </w:rPr>
-        <w:t>在紧固件行业的挑战</w:t>
+        <w:t>在制造业的挑战：</w:t>
       </w:r>
       <w:r>
         <w:rPr>
@@ -1864,7 +1862,6 @@
           <w:i w:val="0"/>
           <w:sz w:val="22"/>
         </w:rPr>
-        <w:t>：</w:t>
       </w:r>
     </w:p>
     <w:p>
@@ -2292,7 +2289,7 @@
           <w:i w:val="0"/>
           <w:sz w:val="22"/>
         </w:rPr>
-        <w:t>在紧固件行业的应用</w:t>
+        <w:t>在制造业的应用：</w:t>
       </w:r>
       <w:r>
         <w:rPr>
@@ -2301,7 +2298,6 @@
           <w:i w:val="0"/>
           <w:sz w:val="22"/>
         </w:rPr>
-        <w:t>：</w:t>
       </w:r>
     </w:p>
     <w:p>
@@ -2459,7 +2455,7 @@
           <w:i w:val="0"/>
           <w:sz w:val="22"/>
         </w:rPr>
-        <w:t>在紧固件行业的实践</w:t>
+        <w:t>在制造业的实践：</w:t>
       </w:r>
       <w:r>
         <w:rPr>
@@ -2468,7 +2464,6 @@
           <w:i w:val="0"/>
           <w:sz w:val="22"/>
         </w:rPr>
-        <w:t>：</w:t>
       </w:r>
     </w:p>
     <w:p>
@@ -3273,7 +3268,7 @@
           <w:i w:val="0"/>
           <w:sz w:val="22"/>
         </w:rPr>
-        <w:t>场景：紧固件生产线上一台设备突发故障</w:t>
+        <w:t>场景：生产线上一台设备突发故障</w:t>
       </w:r>
     </w:p>
     <w:p>
@@ -3498,7 +3493,7 @@
           <w:i w:val="0"/>
           <w:sz w:val="26"/>
         </w:rPr>
-        <w:t>5.2 紧固件制造的精益适用性分析</w:t>
+        <w:t>5.2 制造的精益适用性分析</w:t>
       </w:r>
     </w:p>
     <w:tbl>
@@ -3633,7 +3628,9 @@
             <w:tcW w:type="dxa" w:w="2767"/>
           </w:tcPr>
           <w:p>
-            <w:r/>
+            <w:r>
+              <w:t>产品规格繁多，需要快速切换</w:t>
+            </w:r>
             <w:r>
               <w:rPr>
                 <w:rFonts w:ascii="SimSun" w:hAnsi="SimSun"/>
@@ -3641,7 +3638,6 @@
                 <w:i w:val="0"/>
                 <w:sz w:val="20"/>
               </w:rPr>
-              <w:t>紧固件规格繁多，需要快速切换</w:t>
             </w:r>
           </w:p>
         </w:tc>
@@ -3689,7 +3685,9 @@
             <w:shd w:fill="EDF2F9" w:val="clear"/>
           </w:tcPr>
           <w:p>
-            <w:r/>
+            <w:r>
+              <w:t>机加工、精加工等连续工艺适合精益布局</w:t>
+            </w:r>
             <w:r>
               <w:rPr>
                 <w:rFonts w:ascii="SimSun" w:hAnsi="SimSun"/>
@@ -3697,7 +3695,6 @@
                 <w:i w:val="0"/>
                 <w:sz w:val="20"/>
               </w:rPr>
-              <w:t>冷镦、搓丝等连续工艺适合精益布局</w:t>
             </w:r>
           </w:p>
         </w:tc>
@@ -3968,7 +3965,7 @@
           <w:i w:val="0"/>
           <w:sz w:val="32"/>
         </w:rPr>
-        <w:t>6. 紧固件行业精益转型的意义</w:t>
+        <w:t>6. 制造业精益转型的意义</w:t>
       </w:r>
     </w:p>
     <w:p>
@@ -3996,7 +3993,7 @@
           <w:i w:val="0"/>
           <w:sz w:val="22"/>
         </w:rPr>
-        <w:t>中国是全球最大的紧固件生产国，但行业普遍面临以下挑战：</w:t>
+        <w:t>中国是全球最大的产品生产国，但行业普遍面临以下挑战：</w:t>
       </w:r>
     </w:p>
     <w:p>
@@ -4433,7 +4430,7 @@
           <w:i w:val="0"/>
           <w:sz w:val="26"/>
         </w:rPr>
-        <w:t>6.3 紧固件行业精益转型路线图</w:t>
+        <w:t>6.3 制造业精益转型路线图</w:t>
       </w:r>
     </w:p>
     <w:tbl>
@@ -5267,7 +5264,7 @@
           <w:i/>
           <w:sz w:val="20"/>
         </w:rPr>
-        <w:t>下一步阅读</w:t>
+        <w:t>下一步阅读：02-八大浪费识别指南 —— 深入了解制造过程中的各类浪费及其识别方法。</w:t>
       </w:r>
       <w:r>
         <w:rPr>
@@ -5276,7 +5273,6 @@
           <w:i/>
           <w:sz w:val="20"/>
         </w:rPr>
-        <w:t>：</w:t>
       </w:r>
       <w:r>
         <w:rPr>
@@ -5284,7 +5280,6 @@
           <w:color w:val="2E75B6"/>
           <w:sz w:val="20"/>
         </w:rPr>
-        <w:t>02-八大浪费识别指南</w:t>
       </w:r>
       <w:r>
         <w:rPr>
@@ -5293,7 +5288,6 @@
           <w:i/>
           <w:sz w:val="20"/>
         </w:rPr>
-        <w:t xml:space="preserve"> —— 深入了解紧固件制造过程中的各类浪费及其识别方法。</w:t>
       </w:r>
     </w:p>
     <w:sectPr>

</xml_diff>